<commit_message>
Implementacion del Proceso de Notificaciones desde el Worker Hasta el Cliente. para poder mostrar las Aprobaciones pendientes de OC
</commit_message>
<xml_diff>
--- a/documentos/RQM Aprobacion Ajustes OC/PROPUESTA - Aprobacion_OC.docx
+++ b/documentos/RQM Aprobacion Ajustes OC/PROPUESTA - Aprobacion_OC.docx
@@ -1261,11 +1261,13 @@
             <w:pPr>
               <w:rPr>
                 <w:sz w:val="24"/>
+                <w:highlight w:val="cyan"/>
               </w:rPr>
             </w:pPr>
             <w:r>
               <w:rPr>
                 <w:sz w:val="24"/>
+                <w:highlight w:val="cyan"/>
               </w:rPr>
               <w:t>Flujo de aprobación</w:t>
             </w:r>
@@ -1279,24 +1281,17 @@
             <w:pPr>
               <w:rPr>
                 <w:sz w:val="24"/>
+                <w:highlight w:val="cyan"/>
                 <w:lang w:val="es-CO"/>
               </w:rPr>
             </w:pPr>
             <w:r>
               <w:rPr>
                 <w:sz w:val="24"/>
+                <w:highlight w:val="cyan"/>
                 <w:lang w:val="es-CO"/>
               </w:rPr>
-              <w:t>Aprobar o devolver orden, captura de mo</w:t>
-            </w:r>
-            <w:bookmarkStart w:id="0" w:name="_GoBack"/>
-            <w:bookmarkEnd w:id="0"/>
-            <w:r>
-              <w:rPr>
-                <w:sz w:val="24"/>
-                <w:lang w:val="es-CO"/>
-              </w:rPr>
-              <w:t>tivo</w:t>
+              <w:t>Aprobar o devolver orden, captura de motivo</w:t>
             </w:r>
           </w:p>
         </w:tc>
@@ -1347,11 +1342,13 @@
             <w:pPr>
               <w:rPr>
                 <w:sz w:val="24"/>
+                <w:highlight w:val="cyan"/>
               </w:rPr>
             </w:pPr>
             <w:r>
               <w:rPr>
                 <w:sz w:val="24"/>
+                <w:highlight w:val="cyan"/>
               </w:rPr>
               <w:t>Seguridad y perfiles</w:t>
             </w:r>
@@ -1365,12 +1362,14 @@
             <w:pPr>
               <w:rPr>
                 <w:sz w:val="24"/>
+                <w:highlight w:val="cyan"/>
                 <w:lang w:val="es-CO"/>
               </w:rPr>
             </w:pPr>
             <w:r>
               <w:rPr>
                 <w:sz w:val="24"/>
+                <w:highlight w:val="cyan"/>
                 <w:lang w:val="es-CO"/>
               </w:rPr>
               <w:t>Perfil aprobador y restricciones de edición</w:t>
@@ -1424,11 +1423,13 @@
             <w:pPr>
               <w:rPr>
                 <w:sz w:val="24"/>
+                <w:highlight w:val="cyan"/>
               </w:rPr>
             </w:pPr>
             <w:r>
               <w:rPr>
                 <w:sz w:val="24"/>
+                <w:highlight w:val="cyan"/>
               </w:rPr>
               <w:t>UI Órdenes de Compra</w:t>
             </w:r>
@@ -1442,12 +1443,14 @@
             <w:pPr>
               <w:rPr>
                 <w:sz w:val="24"/>
+                <w:highlight w:val="cyan"/>
                 <w:lang w:val="es-CO"/>
               </w:rPr>
             </w:pPr>
             <w:r>
               <w:rPr>
                 <w:sz w:val="24"/>
+                <w:highlight w:val="cyan"/>
                 <w:lang w:val="es-CO"/>
               </w:rPr>
               <w:t>Mensajes, vistas y bloqueo de edición</w:t>
@@ -1501,11 +1504,13 @@
             <w:pPr>
               <w:rPr>
                 <w:sz w:val="24"/>
+                <w:highlight w:val="cyan"/>
               </w:rPr>
             </w:pPr>
             <w:r>
               <w:rPr>
                 <w:sz w:val="24"/>
+                <w:highlight w:val="cyan"/>
               </w:rPr>
               <w:t>Consulta Pendientes de Aprobación</w:t>
             </w:r>
@@ -1519,11 +1524,13 @@
             <w:pPr>
               <w:rPr>
                 <w:sz w:val="24"/>
+                <w:highlight w:val="cyan"/>
               </w:rPr>
             </w:pPr>
             <w:r>
               <w:rPr>
                 <w:sz w:val="24"/>
+                <w:highlight w:val="cyan"/>
               </w:rPr>
               <w:t>Listado exclusivo para aprobadores</w:t>
             </w:r>
@@ -1623,6 +1630,8 @@
               </w:rPr>
               <w:t>8</w:t>
             </w:r>
+            <w:bookmarkStart w:id="0" w:name="_GoBack"/>
+            <w:bookmarkEnd w:id="0"/>
           </w:p>
         </w:tc>
       </w:tr>
@@ -1653,11 +1662,13 @@
             <w:pPr>
               <w:rPr>
                 <w:sz w:val="24"/>
+                <w:highlight w:val="cyan"/>
               </w:rPr>
             </w:pPr>
             <w:r>
               <w:rPr>
                 <w:sz w:val="24"/>
+                <w:highlight w:val="cyan"/>
               </w:rPr>
               <w:t>Auditoría</w:t>
             </w:r>
@@ -1671,12 +1682,14 @@
             <w:pPr>
               <w:rPr>
                 <w:sz w:val="24"/>
+                <w:highlight w:val="cyan"/>
                 <w:lang w:val="es-CO"/>
               </w:rPr>
             </w:pPr>
             <w:r>
               <w:rPr>
                 <w:sz w:val="24"/>
+                <w:highlight w:val="cyan"/>
                 <w:lang w:val="es-CO"/>
               </w:rPr>
               <w:t>Registro de aprobador, fecha y motivo</w:t>
@@ -1730,11 +1743,13 @@
             <w:pPr>
               <w:rPr>
                 <w:sz w:val="24"/>
+                <w:highlight w:val="cyan"/>
               </w:rPr>
             </w:pPr>
             <w:r>
               <w:rPr>
                 <w:sz w:val="24"/>
+                <w:highlight w:val="cyan"/>
               </w:rPr>
               <w:t>Pruebas integrales</w:t>
             </w:r>
@@ -1748,11 +1763,13 @@
             <w:pPr>
               <w:rPr>
                 <w:sz w:val="24"/>
+                <w:highlight w:val="cyan"/>
               </w:rPr>
             </w:pPr>
             <w:r>
               <w:rPr>
                 <w:sz w:val="24"/>
+                <w:highlight w:val="cyan"/>
               </w:rPr>
               <w:t>Pruebas funcionales y regresión</w:t>
             </w:r>
@@ -16357,7 +16374,7 @@
 </file>
 
 <file path=customXml/itemProps1.xml><?xml version="1.0" encoding="utf-8"?>
-<ds:datastoreItem xmlns:ds="http://schemas.openxmlformats.org/officeDocument/2006/customXml" ds:itemID="{4C94EB14-CD52-4849-8C26-3C7EC2685CCC}">
+<ds:datastoreItem xmlns:ds="http://schemas.openxmlformats.org/officeDocument/2006/customXml" ds:itemID="{09B01C13-FCD3-49C4-B432-9D34CE72E2B6}">
   <ds:schemaRefs>
     <ds:schemaRef ds:uri="http://schemas.openxmlformats.org/officeDocument/2006/bibliography"/>
   </ds:schemaRefs>

</xml_diff>